<commit_message>
creazione versione questionari con domande unificate
</commit_message>
<xml_diff>
--- a/macro-etichette.docx
+++ b/macro-etichette.docx
@@ -4,7 +4,7 @@
   <w:body>
     <w:p>
       <w:pPr>
-        <w:pStyle w:val="Testopreformattatouser"/>
+        <w:pStyle w:val="Testopreformattato"/>
         <w:rPr>
           <w:rFonts w:ascii="Liberation Mono" w:hAnsi="Liberation Mono" w:cs="Liberation Mono"/>
           <w:color w:val="000000"/>
@@ -25,7 +25,7 @@
     </w:p>
     <w:p>
       <w:pPr>
-        <w:pStyle w:val="Testopreformattatouser"/>
+        <w:pStyle w:val="Testopreformattato"/>
         <w:rPr>
           <w:rFonts w:ascii="Liberation Mono" w:hAnsi="Liberation Mono" w:cs="Liberation Mono"/>
           <w:color w:val="000000"/>
@@ -39,13 +39,12 @@
           <w:color w:val="000000"/>
           <w:sz w:val="18"/>
           <w:szCs w:val="18"/>
-          <w:lang w:val="it-IT"/>
         </w:rPr>
       </w:r>
     </w:p>
     <w:p>
       <w:pPr>
-        <w:pStyle w:val="Testopreformattatouser"/>
+        <w:pStyle w:val="Testopreformattato"/>
         <w:rPr>
           <w:rFonts w:cs="Liberation Mono"/>
           <w:color w:val="000000"/>
@@ -70,7 +69,7 @@
     </w:p>
     <w:p>
       <w:pPr>
-        <w:pStyle w:val="Testopreformattatouser"/>
+        <w:pStyle w:val="Testopreformattato"/>
         <w:rPr>
           <w:rFonts w:ascii="Liberation Mono" w:hAnsi="Liberation Mono" w:cs="Liberation Mono"/>
           <w:color w:val="000000"/>
@@ -101,7 +100,7 @@
     </w:p>
     <w:p>
       <w:pPr>
-        <w:pStyle w:val="Testopreformattatouser"/>
+        <w:pStyle w:val="Testopreformattato"/>
         <w:rPr>
           <w:rFonts w:ascii="Liberation Mono" w:hAnsi="Liberation Mono" w:cs="Liberation Mono"/>
           <w:color w:val="000000"/>
@@ -115,13 +114,12 @@
           <w:color w:val="000000"/>
           <w:sz w:val="18"/>
           <w:szCs w:val="18"/>
-          <w:lang w:val="it-IT"/>
         </w:rPr>
       </w:r>
     </w:p>
     <w:p>
       <w:pPr>
-        <w:pStyle w:val="Testopreformattatouser"/>
+        <w:pStyle w:val="Testopreformattato"/>
         <w:rPr>
           <w:rFonts w:ascii="Liberation Mono" w:hAnsi="Liberation Mono" w:cs="Liberation Mono"/>
           <w:color w:val="000000"/>
@@ -142,7 +140,7 @@
     </w:p>
     <w:p>
       <w:pPr>
-        <w:pStyle w:val="Testopreformattatouser"/>
+        <w:pStyle w:val="Testopreformattato"/>
         <w:rPr>
           <w:rFonts w:ascii="Liberation Mono" w:hAnsi="Liberation Mono" w:cs="Liberation Mono"/>
           <w:color w:val="000000"/>
@@ -156,13 +154,12 @@
           <w:color w:val="000000"/>
           <w:sz w:val="18"/>
           <w:szCs w:val="18"/>
-          <w:lang w:val="it-IT"/>
         </w:rPr>
       </w:r>
     </w:p>
     <w:p>
       <w:pPr>
-        <w:pStyle w:val="Testopreformattatouser"/>
+        <w:pStyle w:val="Testopreformattato"/>
         <w:rPr>
           <w:rFonts w:ascii="Liberation Mono" w:hAnsi="Liberation Mono" w:cs="Liberation Mono"/>
           <w:color w:val="000000"/>
@@ -183,7 +180,7 @@
     </w:p>
     <w:p>
       <w:pPr>
-        <w:pStyle w:val="Testopreformattatouser"/>
+        <w:pStyle w:val="Testopreformattato"/>
         <w:rPr>
           <w:rFonts w:ascii="Liberation Mono" w:hAnsi="Liberation Mono" w:cs="Liberation Mono"/>
           <w:color w:val="000000"/>
@@ -197,13 +194,12 @@
           <w:color w:val="000000"/>
           <w:sz w:val="18"/>
           <w:szCs w:val="18"/>
-          <w:lang w:val="it-IT"/>
         </w:rPr>
       </w:r>
     </w:p>
     <w:p>
       <w:pPr>
-        <w:pStyle w:val="Testopreformattatouser"/>
+        <w:pStyle w:val="Testopreformattato"/>
         <w:rPr>
           <w:rFonts w:ascii="Liberation Mono" w:hAnsi="Liberation Mono" w:cs="Liberation Mono"/>
           <w:color w:val="000000"/>
@@ -224,7 +220,7 @@
     </w:p>
     <w:p>
       <w:pPr>
-        <w:pStyle w:val="Testopreformattatouser"/>
+        <w:pStyle w:val="Testopreformattato"/>
         <w:rPr>
           <w:rFonts w:ascii="Liberation Mono" w:hAnsi="Liberation Mono" w:cs="Liberation Mono"/>
           <w:color w:val="000000"/>
@@ -238,13 +234,12 @@
           <w:color w:val="000000"/>
           <w:sz w:val="18"/>
           <w:szCs w:val="18"/>
-          <w:lang w:val="it-IT"/>
         </w:rPr>
       </w:r>
     </w:p>
     <w:p>
       <w:pPr>
-        <w:pStyle w:val="Testopreformattatouser"/>
+        <w:pStyle w:val="Testopreformattato"/>
         <w:rPr>
           <w:rFonts w:ascii="Liberation Mono" w:hAnsi="Liberation Mono" w:cs="Liberation Mono"/>
           <w:color w:val="000000"/>
@@ -260,32 +255,12 @@
           <w:szCs w:val="18"/>
           <w:lang w:val="it-IT"/>
         </w:rPr>
-        <w:t xml:space="preserve">NOTE </w:t>
-      </w:r>
-      <w:r>
-        <w:rPr>
-          <w:rFonts w:cs="Liberation Mono"/>
-          <w:color w:val="000000"/>
-          <w:sz w:val="18"/>
-          <w:szCs w:val="18"/>
-          <w:lang w:val="it-IT"/>
-        </w:rPr>
-        <w:t>PER ANALISI AUTOMATICA</w:t>
-      </w:r>
-      <w:r>
-        <w:rPr>
-          <w:rFonts w:cs="Liberation Mono"/>
-          <w:color w:val="000000"/>
-          <w:sz w:val="18"/>
-          <w:szCs w:val="18"/>
-          <w:lang w:val="it-IT"/>
-        </w:rPr>
-        <w:t>:</w:t>
+        <w:t>NOTE PER ANALISI AUTOMATICA:</w:t>
       </w:r>
     </w:p>
     <w:p>
       <w:pPr>
-        <w:pStyle w:val="Testopreformattatouser"/>
+        <w:pStyle w:val="Testopreformattato"/>
         <w:rPr>
           <w:rFonts w:ascii="Liberation Mono" w:hAnsi="Liberation Mono" w:cs="Liberation Mono"/>
           <w:color w:val="000000"/>
@@ -316,7 +291,7 @@
     </w:p>
     <w:p>
       <w:pPr>
-        <w:pStyle w:val="Testopreformattatouser"/>
+        <w:pStyle w:val="Testopreformattato"/>
         <w:rPr>
           <w:rFonts w:ascii="Liberation Mono" w:hAnsi="Liberation Mono" w:cs="Liberation Mono"/>
           <w:color w:val="000000"/>
@@ -347,7 +322,7 @@
     </w:p>
     <w:p>
       <w:pPr>
-        <w:pStyle w:val="Testopreformattatouser"/>
+        <w:pStyle w:val="Testopreformattato"/>
         <w:rPr>
           <w:rFonts w:ascii="Liberation Mono" w:hAnsi="Liberation Mono" w:cs="Liberation Mono"/>
           <w:color w:val="000000"/>
@@ -374,23 +349,12 @@
           <w:shd w:fill="auto" w:val="clear"/>
           <w:lang w:val="it-IT"/>
         </w:rPr>
-        <w:t xml:space="preserve">osservazione/ memoria/ analisi” </w:t>
-      </w:r>
-      <w:r>
-        <w:rPr>
-          <w:rFonts w:cs="Liberation Mono"/>
-          <w:color w:val="000000"/>
-          <w:sz w:val="18"/>
-          <w:szCs w:val="18"/>
-          <w:shd w:fill="auto" w:val="clear"/>
-          <w:lang w:val="it-IT"/>
-        </w:rPr>
-        <w:t>è scritta nei fogli di classificazione come “osservazione, memoria, analisi”</w:t>
+        <w:t>osservazione/ memoria/ analisi” è scritta nei fogli di classificazione come “osservazione, memoria, analisi”</w:t>
       </w:r>
     </w:p>
     <w:p>
       <w:pPr>
-        <w:pStyle w:val="Testopreformattatouser"/>
+        <w:pStyle w:val="Testopreformattato"/>
         <w:rPr>
           <w:rFonts w:ascii="Liberation Mono" w:hAnsi="Liberation Mono" w:cs="Liberation Mono"/>
           <w:color w:val="000000"/>
@@ -404,14 +368,12 @@
           <w:color w:val="000000"/>
           <w:sz w:val="18"/>
           <w:szCs w:val="18"/>
-          <w:shd w:fill="auto" w:val="clear"/>
-          <w:lang w:val="it-IT"/>
         </w:rPr>
       </w:r>
     </w:p>
     <w:p>
       <w:pPr>
-        <w:pStyle w:val="Testopreformattatouser"/>
+        <w:pStyle w:val="Testopreformattato"/>
         <w:rPr>
           <w:rFonts w:ascii="Liberation Mono" w:hAnsi="Liberation Mono" w:cs="Liberation Mono"/>
           <w:color w:val="000000"/>
@@ -432,7 +394,7 @@
     </w:p>
     <w:p>
       <w:pPr>
-        <w:pStyle w:val="Testopreformattatouser"/>
+        <w:pStyle w:val="Testopreformattato"/>
         <w:rPr>
           <w:rFonts w:ascii="Liberation Mono" w:hAnsi="Liberation Mono" w:cs="Liberation Mono"/>
           <w:color w:val="000000"/>
@@ -446,13 +408,12 @@
           <w:color w:val="000000"/>
           <w:sz w:val="18"/>
           <w:szCs w:val="18"/>
-          <w:lang w:val="it-IT"/>
         </w:rPr>
       </w:r>
     </w:p>
     <w:p>
       <w:pPr>
-        <w:pStyle w:val="Testopreformattatouser"/>
+        <w:pStyle w:val="Testopreformattato"/>
         <w:rPr>
           <w:rFonts w:ascii="Liberation Mono" w:hAnsi="Liberation Mono" w:cs="Liberation Mono"/>
           <w:color w:val="000000"/>
@@ -473,7 +434,7 @@
     </w:p>
     <w:p>
       <w:pPr>
-        <w:pStyle w:val="Testopreformattatouser"/>
+        <w:pStyle w:val="Testopreformattato"/>
         <w:rPr>
           <w:rFonts w:ascii="Liberation Mono" w:hAnsi="Liberation Mono" w:cs="Liberation Mono"/>
           <w:color w:val="000000"/>
@@ -494,7 +455,7 @@
     </w:p>
     <w:p>
       <w:pPr>
-        <w:pStyle w:val="Testopreformattatouser"/>
+        <w:pStyle w:val="Testopreformattato"/>
         <w:rPr>
           <w:rFonts w:ascii="Liberation Mono" w:hAnsi="Liberation Mono" w:cs="Liberation Mono"/>
           <w:color w:val="000000"/>
@@ -515,7 +476,7 @@
     </w:p>
     <w:p>
       <w:pPr>
-        <w:pStyle w:val="Testopreformattatouser"/>
+        <w:pStyle w:val="Testopreformattato"/>
         <w:rPr>
           <w:rFonts w:ascii="Liberation Mono" w:hAnsi="Liberation Mono" w:cs="Liberation Mono"/>
           <w:color w:val="000000"/>
@@ -534,7 +495,7 @@
     </w:p>
     <w:p>
       <w:pPr>
-        <w:pStyle w:val="Testopreformattatouser"/>
+        <w:pStyle w:val="Testopreformattato"/>
         <w:rPr>
           <w:rFonts w:ascii="Liberation Mono" w:hAnsi="Liberation Mono" w:cs="Liberation Mono"/>
           <w:color w:val="000000"/>
@@ -555,7 +516,7 @@
     </w:p>
     <w:p>
       <w:pPr>
-        <w:pStyle w:val="Testopreformattatouser"/>
+        <w:pStyle w:val="Testopreformattato"/>
         <w:rPr>
           <w:highlight w:val="none"/>
           <w:shd w:fill="FFFF00" w:val="clear"/>
@@ -575,7 +536,7 @@
     </w:p>
     <w:p>
       <w:pPr>
-        <w:pStyle w:val="Testopreformattatouser"/>
+        <w:pStyle w:val="Testopreformattato"/>
         <w:rPr>
           <w:highlight w:val="none"/>
           <w:shd w:fill="auto" w:val="clear"/>
@@ -606,7 +567,7 @@
     </w:p>
     <w:p>
       <w:pPr>
-        <w:pStyle w:val="Testopreformattatouser"/>
+        <w:pStyle w:val="Testopreformattato"/>
         <w:rPr>
           <w:highlight w:val="none"/>
           <w:shd w:fill="auto" w:val="clear"/>
@@ -637,7 +598,7 @@
     </w:p>
     <w:p>
       <w:pPr>
-        <w:pStyle w:val="Testopreformattatouser"/>
+        <w:pStyle w:val="Testopreformattato"/>
         <w:rPr>
           <w:highlight w:val="none"/>
           <w:shd w:fill="auto" w:val="clear"/>
@@ -668,7 +629,7 @@
     </w:p>
     <w:p>
       <w:pPr>
-        <w:pStyle w:val="Testopreformattatouser"/>
+        <w:pStyle w:val="Testopreformattato"/>
         <w:rPr>
           <w:highlight w:val="none"/>
           <w:shd w:fill="auto" w:val="clear"/>
@@ -699,7 +660,7 @@
     </w:p>
     <w:p>
       <w:pPr>
-        <w:pStyle w:val="Testopreformattatouser"/>
+        <w:pStyle w:val="Testopreformattato"/>
         <w:rPr>
           <w:highlight w:val="none"/>
           <w:shd w:fill="auto" w:val="clear"/>
@@ -730,7 +691,7 @@
     </w:p>
     <w:p>
       <w:pPr>
-        <w:pStyle w:val="Testopreformattatouser"/>
+        <w:pStyle w:val="Testopreformattato"/>
         <w:rPr>
           <w:highlight w:val="none"/>
           <w:shd w:fill="auto" w:val="clear"/>
@@ -761,7 +722,7 @@
     </w:p>
     <w:p>
       <w:pPr>
-        <w:pStyle w:val="Testopreformattatouser"/>
+        <w:pStyle w:val="Testopreformattato"/>
         <w:rPr>
           <w:highlight w:val="none"/>
           <w:shd w:fill="auto" w:val="clear"/>
@@ -792,7 +753,7 @@
     </w:p>
     <w:p>
       <w:pPr>
-        <w:pStyle w:val="Testopreformattatouser"/>
+        <w:pStyle w:val="Testopreformattato"/>
         <w:rPr>
           <w:highlight w:val="none"/>
           <w:shd w:fill="auto" w:val="clear"/>
@@ -823,7 +784,7 @@
     </w:p>
     <w:p>
       <w:pPr>
-        <w:pStyle w:val="Testopreformattatouser"/>
+        <w:pStyle w:val="Testopreformattato"/>
         <w:rPr>
           <w:rFonts w:ascii="Liberation Mono" w:hAnsi="Liberation Mono" w:cs="Liberation Mono"/>
           <w:color w:val="000000"/>
@@ -845,7 +806,7 @@
     </w:p>
     <w:p>
       <w:pPr>
-        <w:pStyle w:val="Testopreformattatouser"/>
+        <w:pStyle w:val="Testopreformattato"/>
         <w:rPr>
           <w:rFonts w:ascii="Liberation Mono" w:hAnsi="Liberation Mono" w:cs="Liberation Mono"/>
           <w:color w:val="000000"/>
@@ -866,7 +827,7 @@
     </w:p>
     <w:p>
       <w:pPr>
-        <w:pStyle w:val="Testopreformattatouser"/>
+        <w:pStyle w:val="Testopreformattato"/>
         <w:rPr>
           <w:highlight w:val="none"/>
           <w:shd w:fill="FFFF00" w:val="clear"/>
@@ -886,7 +847,7 @@
     </w:p>
     <w:p>
       <w:pPr>
-        <w:pStyle w:val="Testopreformattatouser"/>
+        <w:pStyle w:val="Testopreformattato"/>
         <w:rPr>
           <w:highlight w:val="none"/>
           <w:shd w:fill="auto" w:val="clear"/>
@@ -917,7 +878,7 @@
     </w:p>
     <w:p>
       <w:pPr>
-        <w:pStyle w:val="Testopreformattatouser"/>
+        <w:pStyle w:val="Testopreformattato"/>
         <w:rPr>
           <w:highlight w:val="none"/>
           <w:shd w:fill="auto" w:val="clear"/>
@@ -948,7 +909,7 @@
     </w:p>
     <w:p>
       <w:pPr>
-        <w:pStyle w:val="Testopreformattatouser"/>
+        <w:pStyle w:val="Testopreformattato"/>
         <w:rPr>
           <w:highlight w:val="none"/>
           <w:shd w:fill="auto" w:val="clear"/>
@@ -979,7 +940,7 @@
     </w:p>
     <w:p>
       <w:pPr>
-        <w:pStyle w:val="Testopreformattatouser"/>
+        <w:pStyle w:val="Testopreformattato"/>
         <w:rPr>
           <w:highlight w:val="none"/>
           <w:shd w:fill="auto" w:val="clear"/>
@@ -1010,7 +971,7 @@
     </w:p>
     <w:p>
       <w:pPr>
-        <w:pStyle w:val="Testopreformattatouser"/>
+        <w:pStyle w:val="Testopreformattato"/>
         <w:rPr>
           <w:highlight w:val="none"/>
           <w:shd w:fill="auto" w:val="clear"/>
@@ -1041,7 +1002,7 @@
     </w:p>
     <w:p>
       <w:pPr>
-        <w:pStyle w:val="Testopreformattatouser"/>
+        <w:pStyle w:val="Testopreformattato"/>
         <w:rPr>
           <w:highlight w:val="none"/>
           <w:shd w:fill="auto" w:val="clear"/>
@@ -1072,7 +1033,7 @@
     </w:p>
     <w:p>
       <w:pPr>
-        <w:pStyle w:val="Testopreformattatouser"/>
+        <w:pStyle w:val="Testopreformattato"/>
         <w:rPr>
           <w:highlight w:val="none"/>
           <w:shd w:fill="auto" w:val="clear"/>
@@ -1103,7 +1064,7 @@
     </w:p>
     <w:p>
       <w:pPr>
-        <w:pStyle w:val="Testopreformattatouser"/>
+        <w:pStyle w:val="Testopreformattato"/>
         <w:rPr>
           <w:highlight w:val="none"/>
           <w:shd w:fill="auto" w:val="clear"/>
@@ -1134,7 +1095,7 @@
     </w:p>
     <w:p>
       <w:pPr>
-        <w:pStyle w:val="Testopreformattatouser"/>
+        <w:pStyle w:val="Testopreformattato"/>
         <w:rPr>
           <w:highlight w:val="none"/>
           <w:shd w:fill="auto" w:val="clear"/>
@@ -1160,34 +1121,12 @@
           <w:shd w:fill="auto" w:val="clear"/>
           <w:lang w:val="it-IT"/>
         </w:rPr>
-        <w:t xml:space="preserve">USO TECNOLOGIA E SVILUPPO CONTENUTI: sviluppo contenuti, techno-CLIL, uso della tecnologia, ricerca informazioni, </w:t>
-      </w:r>
-      <w:r>
-        <w:rPr>
-          <w:rFonts w:cs="Liberation Mono"/>
-          <w:color w:val="000000"/>
-          <w:sz w:val="18"/>
-          <w:szCs w:val="18"/>
-          <w:shd w:fill="auto" w:val="clear"/>
-          <w:lang w:val="it-IT"/>
-        </w:rPr>
-        <w:t>3sviluppo contenuti</w:t>
-      </w:r>
-      <w:r>
-        <w:rPr>
-          <w:rFonts w:cs="Liberation Mono"/>
-          <w:color w:val="000000"/>
-          <w:sz w:val="18"/>
-          <w:szCs w:val="18"/>
-          <w:shd w:fill="auto" w:val="clear"/>
-          <w:lang w:val="it-IT"/>
-        </w:rPr>
-        <w:t>.</w:t>
+        <w:t>USO TECNOLOGIA E SVILUPPO CONTENUTI: sviluppo contenuti, techno-CLIL, uso della tecnologia, ricerca informazioni, 3sviluppo contenuti.</w:t>
       </w:r>
     </w:p>
     <w:p>
       <w:pPr>
-        <w:pStyle w:val="Testopreformattatouser"/>
+        <w:pStyle w:val="Testopreformattato"/>
         <w:rPr>
           <w:highlight w:val="none"/>
           <w:shd w:fill="auto" w:val="clear"/>
@@ -1218,7 +1157,7 @@
     </w:p>
     <w:p>
       <w:pPr>
-        <w:pStyle w:val="Testopreformattatouser"/>
+        <w:pStyle w:val="Testopreformattato"/>
         <w:rPr>
           <w:highlight w:val="none"/>
           <w:shd w:fill="auto" w:val="clear"/>
@@ -1249,7 +1188,7 @@
     </w:p>
     <w:p>
       <w:pPr>
-        <w:pStyle w:val="Testopreformattatouser"/>
+        <w:pStyle w:val="Testopreformattato"/>
         <w:rPr>
           <w:highlight w:val="none"/>
           <w:shd w:fill="auto" w:val="clear"/>
@@ -1280,7 +1219,7 @@
     </w:p>
     <w:p>
       <w:pPr>
-        <w:pStyle w:val="Testopreformattatouser"/>
+        <w:pStyle w:val="Testopreformattato"/>
         <w:rPr>
           <w:highlight w:val="none"/>
           <w:shd w:fill="auto" w:val="clear"/>
@@ -1311,7 +1250,7 @@
     </w:p>
     <w:p>
       <w:pPr>
-        <w:pStyle w:val="Testopreformattatouser"/>
+        <w:pStyle w:val="Testopreformattato"/>
         <w:rPr>
           <w:rFonts w:ascii="Liberation Mono" w:hAnsi="Liberation Mono" w:cs="Liberation Mono"/>
           <w:color w:val="000000"/>
@@ -1333,7 +1272,7 @@
     </w:p>
     <w:p>
       <w:pPr>
-        <w:pStyle w:val="Testopreformattatouser"/>
+        <w:pStyle w:val="Testopreformattato"/>
         <w:rPr>
           <w:rFonts w:ascii="Liberation Mono" w:hAnsi="Liberation Mono" w:cs="Liberation Mono"/>
           <w:color w:val="000000"/>
@@ -1354,7 +1293,7 @@
     </w:p>
     <w:p>
       <w:pPr>
-        <w:pStyle w:val="Testopreformattatouser"/>
+        <w:pStyle w:val="Testopreformattato"/>
         <w:rPr/>
       </w:pPr>
       <w:r>
@@ -1371,7 +1310,7 @@
     </w:p>
     <w:p>
       <w:pPr>
-        <w:pStyle w:val="Testopreformattatouser"/>
+        <w:pStyle w:val="Testopreformattato"/>
         <w:rPr>
           <w:highlight w:val="none"/>
           <w:shd w:fill="auto" w:val="clear"/>
@@ -1402,7 +1341,7 @@
     </w:p>
     <w:p>
       <w:pPr>
-        <w:pStyle w:val="Testopreformattatouser"/>
+        <w:pStyle w:val="Testopreformattato"/>
         <w:rPr>
           <w:highlight w:val="none"/>
           <w:shd w:fill="auto" w:val="clear"/>
@@ -1433,7 +1372,7 @@
     </w:p>
     <w:p>
       <w:pPr>
-        <w:pStyle w:val="Testopreformattatouser"/>
+        <w:pStyle w:val="Testopreformattato"/>
         <w:rPr>
           <w:highlight w:val="none"/>
           <w:shd w:fill="auto" w:val="clear"/>
@@ -1464,7 +1403,7 @@
     </w:p>
     <w:p>
       <w:pPr>
-        <w:pStyle w:val="Testopreformattatouser"/>
+        <w:pStyle w:val="Testopreformattato"/>
         <w:rPr>
           <w:highlight w:val="none"/>
           <w:shd w:fill="auto" w:val="clear"/>
@@ -1495,7 +1434,7 @@
     </w:p>
     <w:p>
       <w:pPr>
-        <w:pStyle w:val="Testopreformattatouser"/>
+        <w:pStyle w:val="Testopreformattato"/>
         <w:rPr>
           <w:highlight w:val="none"/>
           <w:shd w:fill="auto" w:val="clear"/>
@@ -1526,7 +1465,7 @@
     </w:p>
     <w:p>
       <w:pPr>
-        <w:pStyle w:val="Testopreformattatouser"/>
+        <w:pStyle w:val="Testopreformattato"/>
         <w:rPr>
           <w:highlight w:val="none"/>
           <w:shd w:fill="auto" w:val="clear"/>
@@ -1557,7 +1496,7 @@
     </w:p>
     <w:p>
       <w:pPr>
-        <w:pStyle w:val="Testopreformattatouser"/>
+        <w:pStyle w:val="Testopreformattato"/>
         <w:rPr>
           <w:highlight w:val="none"/>
           <w:shd w:fill="auto" w:val="clear"/>
@@ -1588,7 +1527,7 @@
     </w:p>
     <w:p>
       <w:pPr>
-        <w:pStyle w:val="Testopreformattatouser"/>
+        <w:pStyle w:val="Testopreformattato"/>
         <w:rPr>
           <w:highlight w:val="none"/>
           <w:shd w:fill="auto" w:val="clear"/>
@@ -1614,34 +1553,12 @@
           <w:shd w:fill="auto" w:val="clear"/>
           <w:lang w:val="it-IT"/>
         </w:rPr>
-        <w:t xml:space="preserve">PIXEL ART: </w:t>
-      </w:r>
-      <w:r>
-        <w:rPr>
-          <w:rFonts w:cs="Liberation Mono"/>
-          <w:color w:val="000000"/>
-          <w:sz w:val="18"/>
-          <w:szCs w:val="18"/>
-          <w:shd w:fill="auto" w:val="clear"/>
-          <w:lang w:val="it-IT"/>
-        </w:rPr>
-        <w:t>Z</w:t>
-      </w:r>
-      <w:r>
-        <w:rPr>
-          <w:rFonts w:cs="Liberation Mono"/>
-          <w:color w:val="000000"/>
-          <w:sz w:val="18"/>
-          <w:szCs w:val="18"/>
-          <w:shd w:fill="auto" w:val="clear"/>
-          <w:lang w:val="it-IT"/>
-        </w:rPr>
-        <w:t>aply.</w:t>
+        <w:t>PIXEL ART: Zaply.</w:t>
       </w:r>
     </w:p>
     <w:p>
       <w:pPr>
-        <w:pStyle w:val="Testopreformattatouser"/>
+        <w:pStyle w:val="Testopreformattato"/>
         <w:rPr>
           <w:rFonts w:ascii="Liberation Mono" w:hAnsi="Liberation Mono" w:cs="Liberation Mono"/>
           <w:color w:val="000000"/>
@@ -1660,7 +1577,7 @@
     </w:p>
     <w:p>
       <w:pPr>
-        <w:pStyle w:val="Testopreformattatouser"/>
+        <w:pStyle w:val="Testopreformattato"/>
         <w:rPr>
           <w:rFonts w:ascii="Liberation Mono" w:hAnsi="Liberation Mono" w:cs="Liberation Mono"/>
           <w:color w:val="000000"/>
@@ -1681,7 +1598,7 @@
     </w:p>
     <w:p>
       <w:pPr>
-        <w:pStyle w:val="Testopreformattatouser"/>
+        <w:pStyle w:val="Testopreformattato"/>
         <w:rPr>
           <w:highlight w:val="none"/>
           <w:shd w:fill="FFFF00" w:val="clear"/>
@@ -1701,7 +1618,7 @@
     </w:p>
     <w:p>
       <w:pPr>
-        <w:pStyle w:val="Testopreformattatouser"/>
+        <w:pStyle w:val="Testopreformattato"/>
         <w:rPr>
           <w:rFonts w:ascii="Liberation Mono" w:hAnsi="Liberation Mono" w:cs="Liberation Mono"/>
           <w:color w:val="000000"/>
@@ -1727,22 +1644,12 @@
           <w:szCs w:val="18"/>
           <w:lang w:val="it-IT"/>
         </w:rPr>
-        <w:t xml:space="preserve">FORSE: </w:t>
-      </w:r>
-      <w:r>
-        <w:rPr>
-          <w:rFonts w:cs="Liberation Mono"/>
-          <w:color w:val="000000"/>
-          <w:sz w:val="18"/>
-          <w:szCs w:val="18"/>
-          <w:lang w:val="it-IT"/>
-        </w:rPr>
-        <w:t>forse (vago).</w:t>
+        <w:t>FORSE: forse (vago).</w:t>
       </w:r>
     </w:p>
     <w:p>
       <w:pPr>
-        <w:pStyle w:val="Testopreformattatouser"/>
+        <w:pStyle w:val="Testopreformattato"/>
         <w:rPr>
           <w:rFonts w:ascii="Liberation Mono" w:hAnsi="Liberation Mono" w:cs="Liberation Mono"/>
           <w:color w:val="000000"/>
@@ -1768,22 +1675,12 @@
           <w:szCs w:val="18"/>
           <w:lang w:val="it-IT"/>
         </w:rPr>
-        <w:t>SÌ:</w:t>
-      </w:r>
-      <w:r>
-        <w:rPr>
-          <w:rFonts w:cs="Liberation Mono"/>
-          <w:color w:val="000000"/>
-          <w:sz w:val="18"/>
-          <w:szCs w:val="18"/>
-          <w:lang w:val="it-IT"/>
-        </w:rPr>
-        <w:t xml:space="preserve"> Sì.</w:t>
+        <w:t>SÌ: Sì.</w:t>
       </w:r>
     </w:p>
     <w:p>
       <w:pPr>
-        <w:pStyle w:val="Testopreformattatouser"/>
+        <w:pStyle w:val="Testopreformattato"/>
         <w:rPr>
           <w:rFonts w:ascii="Liberation Mono" w:hAnsi="Liberation Mono" w:cs="Liberation Mono"/>
           <w:color w:val="000000"/>
@@ -1797,13 +1694,12 @@
           <w:color w:val="000000"/>
           <w:sz w:val="18"/>
           <w:szCs w:val="18"/>
-          <w:lang w:val="it-IT"/>
         </w:rPr>
       </w:r>
     </w:p>
     <w:p>
       <w:pPr>
-        <w:pStyle w:val="Testopreformattatouser"/>
+        <w:pStyle w:val="Testopreformattato"/>
         <w:rPr>
           <w:rFonts w:ascii="Liberation Mono" w:hAnsi="Liberation Mono" w:cs="Liberation Mono"/>
           <w:color w:val="000000"/>
@@ -1817,13 +1713,12 @@
           <w:color w:val="000000"/>
           <w:sz w:val="18"/>
           <w:szCs w:val="18"/>
-          <w:lang w:val="it-IT"/>
         </w:rPr>
       </w:r>
     </w:p>
     <w:p>
       <w:pPr>
-        <w:pStyle w:val="Testopreformattatouser"/>
+        <w:pStyle w:val="Testopreformattato"/>
         <w:spacing w:before="0" w:after="0"/>
         <w:rPr>
           <w:rFonts w:ascii="Liberation Mono" w:hAnsi="Liberation Mono" w:cs="Liberation Mono"/>
@@ -1846,7 +1741,7 @@
     </w:p>
     <w:p>
       <w:pPr>
-        <w:pStyle w:val="Testopreformattatouser"/>
+        <w:pStyle w:val="Testopreformattato"/>
         <w:rPr>
           <w:rFonts w:ascii="Liberation Mono" w:hAnsi="Liberation Mono" w:cs="Liberation Mono"/>
           <w:color w:val="000000"/>
@@ -1867,7 +1762,7 @@
     </w:p>
     <w:p>
       <w:pPr>
-        <w:pStyle w:val="Testopreformattatouser"/>
+        <w:pStyle w:val="Testopreformattato"/>
         <w:rPr>
           <w:rFonts w:ascii="Liberation Mono" w:hAnsi="Liberation Mono" w:cs="Liberation Mono"/>
           <w:color w:val="000000"/>
@@ -1888,7 +1783,7 @@
     </w:p>
     <w:p>
       <w:pPr>
-        <w:pStyle w:val="Testopreformattatouser"/>
+        <w:pStyle w:val="Testopreformattato"/>
         <w:rPr>
           <w:rFonts w:ascii="Liberation Mono" w:hAnsi="Liberation Mono" w:cs="Liberation Mono"/>
           <w:color w:val="000000"/>
@@ -1907,7 +1802,7 @@
     </w:p>
     <w:p>
       <w:pPr>
-        <w:pStyle w:val="Testopreformattatouser"/>
+        <w:pStyle w:val="Testopreformattato"/>
         <w:rPr>
           <w:rFonts w:ascii="Liberation Mono" w:hAnsi="Liberation Mono" w:cs="Liberation Mono"/>
           <w:color w:val="000000"/>
@@ -1928,7 +1823,7 @@
     </w:p>
     <w:p>
       <w:pPr>
-        <w:pStyle w:val="Testopreformattatouser"/>
+        <w:pStyle w:val="Testopreformattato"/>
         <w:rPr>
           <w:highlight w:val="none"/>
           <w:shd w:fill="FFFF00" w:val="clear"/>
@@ -1948,7 +1843,7 @@
     </w:p>
     <w:p>
       <w:pPr>
-        <w:pStyle w:val="Testopreformattatouser"/>
+        <w:pStyle w:val="Testopreformattato"/>
         <w:rPr>
           <w:highlight w:val="none"/>
           <w:shd w:fill="auto" w:val="clear"/>
@@ -1989,7 +1884,7 @@
     </w:p>
     <w:p>
       <w:pPr>
-        <w:pStyle w:val="Testopreformattatouser"/>
+        <w:pStyle w:val="Testopreformattato"/>
         <w:rPr>
           <w:highlight w:val="none"/>
           <w:shd w:fill="auto" w:val="clear"/>
@@ -2051,7 +1946,7 @@
     </w:p>
     <w:p>
       <w:pPr>
-        <w:pStyle w:val="Testopreformattatouser"/>
+        <w:pStyle w:val="Testopreformattato"/>
         <w:rPr>
           <w:highlight w:val="none"/>
           <w:shd w:fill="auto" w:val="clear"/>
@@ -2077,29 +1972,7 @@
           <w:shd w:fill="auto" w:val="clear"/>
           <w:lang w:val="it-IT"/>
         </w:rPr>
-        <w:t xml:space="preserve">GENERICO: informatica, pensiero computazionale, </w:t>
-      </w:r>
-      <w:r>
-        <w:rPr>
-          <w:rFonts w:cs="Liberation Mono"/>
-          <w:color w:val="000000"/>
-          <w:sz w:val="18"/>
-          <w:szCs w:val="18"/>
-          <w:shd w:fill="auto" w:val="clear"/>
-          <w:lang w:val="it-IT"/>
-        </w:rPr>
-        <w:t xml:space="preserve">2pensiero computazionale, </w:t>
-      </w:r>
-      <w:r>
-        <w:rPr>
-          <w:rFonts w:cs="Liberation Mono"/>
-          <w:color w:val="000000"/>
-          <w:sz w:val="18"/>
-          <w:szCs w:val="18"/>
-          <w:shd w:fill="auto" w:val="clear"/>
-          <w:lang w:val="it-IT"/>
-        </w:rPr>
-        <w:t>coding, abilità informatiche</w:t>
+        <w:t>GENERICO: informatica, pensiero computazionale, 2pensiero computazionale, coding, abilità informatiche</w:t>
       </w:r>
       <w:r>
         <w:rPr>
@@ -2134,7 +2007,7 @@
     </w:p>
     <w:p>
       <w:pPr>
-        <w:pStyle w:val="Testopreformattatouser"/>
+        <w:pStyle w:val="Testopreformattato"/>
         <w:rPr>
           <w:highlight w:val="none"/>
           <w:shd w:fill="auto" w:val="clear"/>
@@ -2175,7 +2048,7 @@
     </w:p>
     <w:p>
       <w:pPr>
-        <w:pStyle w:val="Testopreformattatouser"/>
+        <w:pStyle w:val="Testopreformattato"/>
         <w:rPr>
           <w:highlight w:val="none"/>
           <w:shd w:fill="auto" w:val="clear"/>
@@ -2215,7 +2088,7 @@
     </w:p>
     <w:p>
       <w:pPr>
-        <w:pStyle w:val="Testopreformattatouser"/>
+        <w:pStyle w:val="Testopreformattato"/>
         <w:rPr>
           <w:highlight w:val="none"/>
           <w:shd w:fill="auto" w:val="clear"/>
@@ -2265,7 +2138,7 @@
     </w:p>
     <w:p>
       <w:pPr>
-        <w:pStyle w:val="Testopreformattatouser"/>
+        <w:pStyle w:val="Testopreformattato"/>
         <w:rPr>
           <w:highlight w:val="none"/>
           <w:shd w:fill="auto" w:val="clear"/>
@@ -2320,7 +2193,7 @@
     </w:p>
     <w:p>
       <w:pPr>
-        <w:pStyle w:val="Testopreformattatouser"/>
+        <w:pStyle w:val="Testopreformattato"/>
         <w:rPr>
           <w:highlight w:val="none"/>
           <w:shd w:fill="auto" w:val="clear"/>
@@ -2389,7 +2262,7 @@
     </w:p>
     <w:p>
       <w:pPr>
-        <w:pStyle w:val="Testopreformattatouser"/>
+        <w:pStyle w:val="Testopreformattato"/>
         <w:rPr>
           <w:highlight w:val="none"/>
           <w:shd w:fill="auto" w:val="clear"/>
@@ -2416,7 +2289,7 @@
     </w:p>
     <w:p>
       <w:pPr>
-        <w:pStyle w:val="Testopreformattatouser"/>
+        <w:pStyle w:val="Testopreformattato"/>
         <w:rPr>
           <w:highlight w:val="none"/>
           <w:shd w:fill="auto" w:val="clear"/>
@@ -2478,7 +2351,7 @@
     </w:p>
     <w:p>
       <w:pPr>
-        <w:pStyle w:val="Testopreformattatouser"/>
+        <w:pStyle w:val="Testopreformattato"/>
         <w:rPr>
           <w:highlight w:val="none"/>
           <w:shd w:fill="auto" w:val="clear"/>
@@ -2504,45 +2377,12 @@
           <w:shd w:fill="auto" w:val="clear"/>
           <w:lang w:val="it-IT"/>
         </w:rPr>
-        <w:t>CONSAPEVOLEZZA DIGITALE: consapevolezza digitale, scelta degli strumenti, responsabilizzare, uso consapevole/ critico della tecnologia in rete</w:t>
-      </w:r>
-      <w:r>
-        <w:rPr>
-          <w:rFonts w:cs="Liberation Mono"/>
-          <w:color w:val="000000"/>
-          <w:sz w:val="18"/>
-          <w:szCs w:val="18"/>
-          <w:shd w:fill="auto" w:val="clear"/>
-          <w:lang w:val="it-IT"/>
-        </w:rPr>
-        <w:t xml:space="preserve">, </w:t>
-      </w:r>
-      <w:r>
-        <w:rPr>
-          <w:rFonts w:cs="Liberation Mono"/>
-          <w:color w:val="000000"/>
-          <w:sz w:val="18"/>
-          <w:szCs w:val="18"/>
-          <w:shd w:fill="auto" w:val="clear"/>
-          <w:lang w:val="it-IT"/>
-        </w:rPr>
-        <w:t xml:space="preserve">selezione strumenti, </w:t>
-      </w:r>
-      <w:r>
-        <w:rPr>
-          <w:rFonts w:cs="Liberation Mono"/>
-          <w:color w:val="000000"/>
-          <w:sz w:val="18"/>
-          <w:szCs w:val="18"/>
-          <w:shd w:fill="auto" w:val="clear"/>
-          <w:lang w:val="it-IT"/>
-        </w:rPr>
-        <w:t>uso sicuro della tecnologia.</w:t>
+        <w:t>CONSAPEVOLEZZA DIGITALE: consapevolezza digitale, scelta degli strumenti, responsabilizzare, uso consapevole/ critico della tecnologia in rete, selezione strumenti, uso sicuro della tecnologia.</w:t>
       </w:r>
     </w:p>
     <w:p>
       <w:pPr>
-        <w:pStyle w:val="Testopreformattatouser"/>
+        <w:pStyle w:val="Testopreformattato"/>
         <w:rPr>
           <w:rFonts w:ascii="Liberation Mono" w:hAnsi="Liberation Mono" w:cs="Liberation Mono"/>
           <w:color w:val="000000"/>
@@ -2566,7 +2406,7 @@
     </w:p>
     <w:p>
       <w:pPr>
-        <w:pStyle w:val="Testopreformattatouser"/>
+        <w:pStyle w:val="Testopreformattato"/>
         <w:rPr>
           <w:rFonts w:ascii="Liberation Mono" w:hAnsi="Liberation Mono" w:cs="Liberation Mono"/>
           <w:color w:val="000000"/>
@@ -2587,7 +2427,7 @@
     </w:p>
     <w:p>
       <w:pPr>
-        <w:pStyle w:val="Testopreformattatouser"/>
+        <w:pStyle w:val="Testopreformattato"/>
         <w:rPr>
           <w:rFonts w:ascii="Liberation Mono" w:hAnsi="Liberation Mono" w:cs="Liberation Mono"/>
           <w:color w:val="000000"/>
@@ -2620,7 +2460,7 @@
     </w:p>
     <w:p>
       <w:pPr>
-        <w:pStyle w:val="Testopreformattatouser"/>
+        <w:pStyle w:val="Testopreformattato"/>
         <w:rPr>
           <w:rFonts w:cs="Liberation Mono"/>
           <w:color w:val="000000"/>
@@ -2651,56 +2491,12 @@
           <w:shd w:fill="auto" w:val="clear"/>
           <w:lang w:val="it-IT"/>
         </w:rPr>
-        <w:t xml:space="preserve">PROBLEM SOLVING: problem solving, </w:t>
-      </w:r>
-      <w:r>
-        <w:rPr>
-          <w:rFonts w:cs="Liberation Mono"/>
-          <w:color w:val="000000"/>
-          <w:sz w:val="18"/>
-          <w:szCs w:val="18"/>
-          <w:shd w:fill="auto" w:val="clear"/>
-          <w:lang w:val="it-IT"/>
-        </w:rPr>
-        <w:t xml:space="preserve">2risoluzione di problemi, </w:t>
-      </w:r>
-      <w:r>
-        <w:rPr>
-          <w:rFonts w:cs="Liberation Mono"/>
-          <w:color w:val="000000"/>
-          <w:sz w:val="18"/>
-          <w:szCs w:val="18"/>
-          <w:shd w:fill="auto" w:val="clear"/>
-          <w:lang w:val="it-IT"/>
-        </w:rPr>
-        <w:t>comprensione/analisi del problema, considerare diverse strategie risolutive, valutazione della soluzione, differenti strategie di risoluzione, approccio per tentativi ed errori, formulazione di ipotesi, risoluzione di problemi, formulazione di domand</w:t>
-      </w:r>
-      <w:r>
-        <w:rPr>
-          <w:rFonts w:cs="Liberation Mono"/>
-          <w:color w:val="000000"/>
-          <w:sz w:val="18"/>
-          <w:szCs w:val="18"/>
-          <w:shd w:fill="auto" w:val="clear"/>
-          <w:lang w:val="it-IT"/>
-        </w:rPr>
-        <w:t>e</w:t>
-      </w:r>
-      <w:r>
-        <w:rPr>
-          <w:rFonts w:cs="Liberation Mono"/>
-          <w:color w:val="000000"/>
-          <w:sz w:val="18"/>
-          <w:szCs w:val="18"/>
-          <w:shd w:fill="auto" w:val="clear"/>
-          <w:lang w:val="it-IT"/>
-        </w:rPr>
-        <w:t>.</w:t>
+        <w:t>PROBLEM SOLVING: problem solving, 2risoluzione di problemi, comprensione/analisi del problema, considerare diverse strategie risolutive, valutazione della soluzione, differenti strategie di risoluzione, approccio per tentativi ed errori, formulazione di ipotesi, risoluzione di problemi, formulazione di domande.</w:t>
       </w:r>
     </w:p>
     <w:p>
       <w:pPr>
-        <w:pStyle w:val="Testopreformattatouser"/>
+        <w:pStyle w:val="Testopreformattato"/>
         <w:rPr>
           <w:highlight w:val="none"/>
           <w:shd w:fill="auto" w:val="clear"/>
@@ -2726,23 +2522,12 @@
           <w:shd w:fill="auto" w:val="clear"/>
           <w:lang w:val="it-IT"/>
         </w:rPr>
-        <w:t xml:space="preserve">LOGICA: logica/ pensiero logico/ competenze logiche, </w:t>
-      </w:r>
-      <w:r>
-        <w:rPr>
-          <w:rFonts w:cs="Liberation Mono"/>
-          <w:color w:val="000000"/>
-          <w:sz w:val="18"/>
-          <w:szCs w:val="18"/>
-          <w:shd w:fill="auto" w:val="clear"/>
-          <w:lang w:val="it-IT"/>
-        </w:rPr>
-        <w:t>pensiero logico.</w:t>
+        <w:t>LOGICA: logica/ pensiero logico/ competenze logiche, pensiero logico.</w:t>
       </w:r>
     </w:p>
     <w:p>
       <w:pPr>
-        <w:pStyle w:val="Testopreformattatouser"/>
+        <w:pStyle w:val="Testopreformattato"/>
         <w:rPr>
           <w:highlight w:val="none"/>
           <w:shd w:fill="auto" w:val="clear"/>
@@ -2795,7 +2580,7 @@
     </w:p>
     <w:p>
       <w:pPr>
-        <w:pStyle w:val="Testopreformattatouser"/>
+        <w:pStyle w:val="Testopreformattato"/>
         <w:rPr>
           <w:rFonts w:ascii="Liberation Mono" w:hAnsi="Liberation Mono" w:cs="Liberation Mono"/>
           <w:color w:val="000000"/>
@@ -2817,7 +2602,7 @@
     </w:p>
     <w:p>
       <w:pPr>
-        <w:pStyle w:val="Testopreformattatouser"/>
+        <w:pStyle w:val="Testopreformattato"/>
         <w:rPr>
           <w:rFonts w:ascii="Liberation Mono" w:hAnsi="Liberation Mono" w:cs="Liberation Mono"/>
           <w:color w:val="000000"/>
@@ -2838,7 +2623,7 @@
     </w:p>
     <w:p>
       <w:pPr>
-        <w:pStyle w:val="Testopreformattatouser"/>
+        <w:pStyle w:val="Testopreformattato"/>
         <w:rPr>
           <w:highlight w:val="none"/>
           <w:shd w:fill="FFFF00" w:val="clear"/>
@@ -2853,34 +2638,12 @@
           <w:shd w:fill="FFFF00" w:val="clear"/>
           <w:lang w:val="it-IT"/>
         </w:rPr>
-        <w:t xml:space="preserve">risposta generica </w:t>
-      </w:r>
-      <w:r>
-        <w:rPr>
-          <w:rFonts w:cs="Liberation Mono"/>
-          <w:color w:val="000000"/>
-          <w:sz w:val="18"/>
-          <w:szCs w:val="18"/>
-          <w:shd w:fill="FFFF00" w:val="clear"/>
-          <w:lang w:val="it-IT"/>
-        </w:rPr>
-        <w:t>D</w:t>
-      </w:r>
-      <w:r>
-        <w:rPr>
-          <w:rFonts w:cs="Liberation Mono"/>
-          <w:color w:val="000000"/>
-          <w:sz w:val="18"/>
-          <w:szCs w:val="18"/>
-          <w:shd w:fill="FFFF00" w:val="clear"/>
-          <w:lang w:val="it-IT"/>
-        </w:rPr>
-        <w:t>2</w:t>
+        <w:t>risposta generica D2</w:t>
       </w:r>
     </w:p>
     <w:p>
       <w:pPr>
-        <w:pStyle w:val="Testopreformattatouser"/>
+        <w:pStyle w:val="Testopreformattato"/>
         <w:rPr>
           <w:rFonts w:ascii="Liberation Mono" w:hAnsi="Liberation Mono" w:cs="Liberation Mono"/>
           <w:color w:val="000000"/>
@@ -2906,42 +2669,12 @@
           <w:szCs w:val="18"/>
           <w:lang w:val="it-IT"/>
         </w:rPr>
-        <w:t>GENERICO-</w:t>
-      </w:r>
-      <w:r>
-        <w:rPr>
-          <w:rFonts w:cs="Liberation Mono"/>
-          <w:color w:val="000000"/>
-          <w:sz w:val="18"/>
-          <w:szCs w:val="18"/>
-          <w:lang w:val="it-IT"/>
-        </w:rPr>
-        <w:t>D2</w:t>
-      </w:r>
-      <w:r>
-        <w:rPr>
-          <w:rFonts w:cs="Liberation Mono"/>
-          <w:color w:val="000000"/>
-          <w:sz w:val="18"/>
-          <w:szCs w:val="18"/>
-          <w:lang w:val="it-IT"/>
-        </w:rPr>
-        <w:t xml:space="preserve">: </w:t>
-      </w:r>
-      <w:r>
-        <w:rPr>
-          <w:rFonts w:cs="Liberation Mono"/>
-          <w:color w:val="000000"/>
-          <w:sz w:val="18"/>
-          <w:szCs w:val="18"/>
-          <w:lang w:val="it-IT"/>
-        </w:rPr>
-        <w:t>generico.</w:t>
+        <w:t>GENERICO-D2: generico.</w:t>
       </w:r>
     </w:p>
     <w:p>
       <w:pPr>
-        <w:pStyle w:val="Testopreformattatouser"/>
+        <w:pStyle w:val="Testopreformattato"/>
         <w:rPr>
           <w:rFonts w:ascii="Liberation Mono" w:hAnsi="Liberation Mono" w:cs="Liberation Mono"/>
           <w:color w:val="000000"/>
@@ -2967,42 +2700,12 @@
           <w:szCs w:val="18"/>
           <w:lang w:val="it-IT"/>
         </w:rPr>
-        <w:t>VUOTO-</w:t>
-      </w:r>
-      <w:r>
-        <w:rPr>
-          <w:rFonts w:cs="Liberation Mono"/>
-          <w:color w:val="000000"/>
-          <w:sz w:val="18"/>
-          <w:szCs w:val="18"/>
-          <w:lang w:val="it-IT"/>
-        </w:rPr>
-        <w:t>D2</w:t>
-      </w:r>
-      <w:r>
-        <w:rPr>
-          <w:rFonts w:cs="Liberation Mono"/>
-          <w:color w:val="000000"/>
-          <w:sz w:val="18"/>
-          <w:szCs w:val="18"/>
-          <w:lang w:val="it-IT"/>
-        </w:rPr>
-        <w:t xml:space="preserve">: </w:t>
-      </w:r>
-      <w:r>
-        <w:rPr>
-          <w:rFonts w:cs="Liberation Mono"/>
-          <w:color w:val="000000"/>
-          <w:sz w:val="18"/>
-          <w:szCs w:val="18"/>
-          <w:lang w:val="it-IT"/>
-        </w:rPr>
-        <w:t>vuoto.</w:t>
+        <w:t>VUOTO-D2: vuoto.</w:t>
       </w:r>
     </w:p>
     <w:p>
       <w:pPr>
-        <w:pStyle w:val="Testopreformattatouser"/>
+        <w:pStyle w:val="Testopreformattato"/>
         <w:rPr>
           <w:rFonts w:ascii="Liberation Mono" w:hAnsi="Liberation Mono" w:cs="Liberation Mono"/>
           <w:color w:val="000000"/>
@@ -3021,7 +2724,7 @@
     </w:p>
     <w:p>
       <w:pPr>
-        <w:pStyle w:val="Testopreformattatouser"/>
+        <w:pStyle w:val="Testopreformattato"/>
         <w:rPr>
           <w:rFonts w:ascii="Liberation Mono" w:hAnsi="Liberation Mono" w:cs="Liberation Mono"/>
           <w:color w:val="000000"/>
@@ -3042,7 +2745,7 @@
     </w:p>
     <w:p>
       <w:pPr>
-        <w:pStyle w:val="Testopreformattatouser"/>
+        <w:pStyle w:val="Testopreformattato"/>
         <w:rPr>
           <w:highlight w:val="none"/>
           <w:shd w:fill="FFFF00" w:val="clear"/>
@@ -3062,7 +2765,7 @@
     </w:p>
     <w:p>
       <w:pPr>
-        <w:pStyle w:val="Testopreformattatouser"/>
+        <w:pStyle w:val="Testopreformattato"/>
         <w:rPr>
           <w:rFonts w:ascii="Liberation Mono" w:hAnsi="Liberation Mono" w:cs="Liberation Mono"/>
           <w:color w:val="000000"/>
@@ -3088,22 +2791,12 @@
           <w:szCs w:val="18"/>
           <w:lang w:val="it-IT"/>
         </w:rPr>
-        <w:t xml:space="preserve">CONTENUTO: </w:t>
-      </w:r>
-      <w:r>
-        <w:rPr>
-          <w:rFonts w:cs="Liberation Mono"/>
-          <w:color w:val="000000"/>
-          <w:sz w:val="18"/>
-          <w:szCs w:val="18"/>
-          <w:lang w:val="it-IT"/>
-        </w:rPr>
-        <w:t>contenuto.</w:t>
+        <w:t>CONTENUTO: contenuto.</w:t>
       </w:r>
     </w:p>
     <w:p>
       <w:pPr>
-        <w:pStyle w:val="Testopreformattatouser"/>
+        <w:pStyle w:val="Testopreformattato"/>
         <w:rPr>
           <w:rFonts w:ascii="Liberation Mono" w:hAnsi="Liberation Mono" w:cs="Liberation Mono"/>
           <w:color w:val="000000"/>
@@ -3129,22 +2822,12 @@
           <w:szCs w:val="18"/>
           <w:lang w:val="it-IT"/>
         </w:rPr>
-        <w:t xml:space="preserve">INSEGNANTE: </w:t>
-      </w:r>
-      <w:r>
-        <w:rPr>
-          <w:rFonts w:cs="Liberation Mono"/>
-          <w:color w:val="000000"/>
-          <w:sz w:val="18"/>
-          <w:szCs w:val="18"/>
-          <w:lang w:val="it-IT"/>
-        </w:rPr>
-        <w:t>insegnante.</w:t>
+        <w:t>INSEGNANTE: insegnante.</w:t>
       </w:r>
     </w:p>
     <w:p>
       <w:pPr>
-        <w:pStyle w:val="Testopreformattatouser"/>
+        <w:pStyle w:val="Testopreformattato"/>
         <w:rPr>
           <w:rFonts w:ascii="Liberation Mono" w:hAnsi="Liberation Mono" w:cs="Liberation Mono"/>
           <w:color w:val="000000"/>
@@ -3175,7 +2858,7 @@
     </w:p>
     <w:p>
       <w:pPr>
-        <w:pStyle w:val="Testopreformattatouser"/>
+        <w:pStyle w:val="Testopreformattato"/>
         <w:rPr>
           <w:rFonts w:ascii="Liberation Mono" w:hAnsi="Liberation Mono" w:cs="Liberation Mono"/>
           <w:color w:val="000000"/>
@@ -3194,7 +2877,7 @@
     </w:p>
     <w:p>
       <w:pPr>
-        <w:pStyle w:val="Testopreformattatouser"/>
+        <w:pStyle w:val="Testopreformattato"/>
         <w:rPr>
           <w:rFonts w:ascii="Liberation Mono" w:hAnsi="Liberation Mono" w:cs="Liberation Mono"/>
           <w:color w:val="000000"/>
@@ -3215,7 +2898,7 @@
     </w:p>
     <w:p>
       <w:pPr>
-        <w:pStyle w:val="Testopreformattatouser"/>
+        <w:pStyle w:val="Testopreformattato"/>
         <w:rPr>
           <w:highlight w:val="none"/>
           <w:shd w:fill="FFFF00" w:val="clear"/>
@@ -3235,7 +2918,7 @@
     </w:p>
     <w:p>
       <w:pPr>
-        <w:pStyle w:val="Testopreformattatouser"/>
+        <w:pStyle w:val="Testopreformattato"/>
         <w:ind w:hanging="0"/>
         <w:rPr>
           <w:highlight w:val="none"/>
@@ -3262,111 +2945,12 @@
           <w:shd w:fill="auto" w:val="clear"/>
           <w:lang w:val="it-IT"/>
         </w:rPr>
-        <w:t xml:space="preserve">USO DI STRUMENTI DIGITALI: alfabetizzazione digitale, uso dei mezzi di comunicazione, uso della tecnologia, </w:t>
-      </w:r>
-      <w:r>
-        <w:rPr>
-          <w:rFonts w:cs="Liberation Mono"/>
-          <w:color w:val="000000"/>
-          <w:sz w:val="18"/>
-          <w:szCs w:val="18"/>
-          <w:shd w:fill="auto" w:val="clear"/>
-          <w:lang w:val="it-IT"/>
-        </w:rPr>
-        <w:t xml:space="preserve">uso della tecnologia2-dedot, 2uso della tecnologia2, </w:t>
-      </w:r>
-      <w:r>
-        <w:rPr>
-          <w:rFonts w:cs="Liberation Mono"/>
-          <w:color w:val="000000"/>
-          <w:sz w:val="18"/>
-          <w:szCs w:val="18"/>
-          <w:shd w:fill="auto" w:val="clear"/>
-          <w:lang w:val="it-IT"/>
-        </w:rPr>
-        <w:t>piattaforma di debate, uso di giochi didattici, ricerca di informazioni su Internet, uso di Internet, videoscrittura</w:t>
-      </w:r>
-      <w:r>
-        <w:rPr>
-          <w:rFonts w:cs="Liberation Mono"/>
-          <w:color w:val="000000"/>
-          <w:sz w:val="18"/>
-          <w:szCs w:val="18"/>
-          <w:shd w:fill="auto" w:val="clear"/>
-          <w:lang w:val="it-IT"/>
-        </w:rPr>
-        <w:t xml:space="preserve">, </w:t>
-      </w:r>
-      <w:r>
-        <w:rPr>
-          <w:rFonts w:cs="Liberation Mono"/>
-          <w:color w:val="000000"/>
-          <w:sz w:val="18"/>
-          <w:szCs w:val="18"/>
-          <w:shd w:fill="auto" w:val="clear"/>
-          <w:lang w:val="it-IT"/>
-        </w:rPr>
-        <w:t>2videoscrittura,</w:t>
-      </w:r>
-      <w:r>
-        <w:rPr>
-          <w:rFonts w:cs="Liberation Mono"/>
-          <w:color w:val="000000"/>
-          <w:sz w:val="18"/>
-          <w:szCs w:val="18"/>
-          <w:shd w:fill="auto" w:val="clear"/>
-          <w:lang w:val="it-IT"/>
-        </w:rPr>
-        <w:t xml:space="preserve"> </w:t>
-      </w:r>
-      <w:r>
-        <w:rPr>
-          <w:rFonts w:cs="Liberation Mono"/>
-          <w:color w:val="000000"/>
-          <w:sz w:val="18"/>
-          <w:szCs w:val="18"/>
-          <w:shd w:fill="auto" w:val="clear"/>
-          <w:lang w:val="it-IT"/>
-        </w:rPr>
-        <w:t xml:space="preserve">3videotutorial, </w:t>
-      </w:r>
-      <w:r>
-        <w:rPr>
-          <w:rFonts w:cs="Liberation Mono"/>
-          <w:color w:val="000000"/>
-          <w:sz w:val="18"/>
-          <w:szCs w:val="18"/>
-          <w:shd w:fill="auto" w:val="clear"/>
-          <w:lang w:val="it-IT"/>
-        </w:rPr>
-        <w:t>competenze digitali, uso di siti web,</w:t>
-      </w:r>
-      <w:r>
-        <w:rPr>
-          <w:rFonts w:cs="Liberation Mono"/>
-          <w:color w:val="000000"/>
-          <w:sz w:val="18"/>
-          <w:szCs w:val="18"/>
-          <w:shd w:fill="auto" w:val="clear"/>
-          <w:lang w:val="it-IT"/>
-        </w:rPr>
-        <w:t xml:space="preserve"> 2uso di app didattiche, 3sviluppo contenuti</w:t>
-      </w:r>
-      <w:r>
-        <w:rPr>
-          <w:rFonts w:cs="Liberation Mono"/>
-          <w:color w:val="000000"/>
-          <w:sz w:val="18"/>
-          <w:szCs w:val="18"/>
-          <w:shd w:fill="auto" w:val="clear"/>
-          <w:lang w:val="it-IT"/>
-        </w:rPr>
-        <w:t>.</w:t>
+        <w:t>USO DI STRUMENTI DIGITALI: alfabetizzazione digitale, uso dei mezzi di comunicazione, uso della tecnologia, uso della tecnologia2-dedot, 2uso della tecnologia2, piattaforma di debate, uso di giochi didattici, ricerca di informazioni su Internet, uso di Internet, videoscrittura, 2videoscrittura, 3videotutorial, competenze digitali, uso di siti web, 2uso di app didattiche, 3sviluppo contenuti.</w:t>
       </w:r>
     </w:p>
     <w:p>
       <w:pPr>
-        <w:pStyle w:val="Testopreformattatouser"/>
+        <w:pStyle w:val="Testopreformattato"/>
         <w:ind w:hanging="0"/>
         <w:rPr>
           <w:rFonts w:ascii="Liberation Mono" w:hAnsi="Liberation Mono" w:cs="Liberation Mono"/>
@@ -3389,7 +2973,7 @@
     </w:p>
     <w:p>
       <w:pPr>
-        <w:pStyle w:val="Testopreformattatouser"/>
+        <w:pStyle w:val="Testopreformattato"/>
         <w:rPr>
           <w:rFonts w:ascii="Liberation Mono" w:hAnsi="Liberation Mono" w:cs="Liberation Mono"/>
           <w:color w:val="000000"/>
@@ -3408,7 +2992,7 @@
     </w:p>
     <w:p>
       <w:pPr>
-        <w:pStyle w:val="Testopreformattatouser"/>
+        <w:pStyle w:val="Testopreformattato"/>
         <w:spacing w:before="0" w:after="0"/>
         <w:rPr>
           <w:rFonts w:ascii="Liberation Mono" w:hAnsi="Liberation Mono" w:cs="Liberation Mono"/>
@@ -3431,7 +3015,7 @@
     </w:p>
     <w:p>
       <w:pPr>
-        <w:pStyle w:val="Testopreformattatouser"/>
+        <w:pStyle w:val="Testopreformattato"/>
         <w:rPr>
           <w:rFonts w:ascii="Liberation Mono" w:hAnsi="Liberation Mono" w:cs="Liberation Mono"/>
           <w:color w:val="000000"/>
@@ -3452,7 +3036,7 @@
     </w:p>
     <w:p>
       <w:pPr>
-        <w:pStyle w:val="Testopreformattatouser"/>
+        <w:pStyle w:val="Testopreformattato"/>
         <w:rPr>
           <w:rFonts w:ascii="Liberation Mono" w:hAnsi="Liberation Mono" w:cs="Liberation Mono"/>
           <w:color w:val="000000"/>
@@ -3473,7 +3057,7 @@
     </w:p>
     <w:p>
       <w:pPr>
-        <w:pStyle w:val="Testopreformattatouser"/>
+        <w:pStyle w:val="Testopreformattato"/>
         <w:rPr>
           <w:rFonts w:ascii="Liberation Mono" w:hAnsi="Liberation Mono" w:cs="Liberation Mono"/>
           <w:color w:val="000000"/>
@@ -3492,7 +3076,7 @@
     </w:p>
     <w:p>
       <w:pPr>
-        <w:pStyle w:val="Testopreformattatouser"/>
+        <w:pStyle w:val="Testopreformattato"/>
         <w:rPr>
           <w:rFonts w:ascii="Liberation Mono" w:hAnsi="Liberation Mono" w:cs="Liberation Mono"/>
           <w:color w:val="000000"/>
@@ -3513,7 +3097,7 @@
     </w:p>
     <w:p>
       <w:pPr>
-        <w:pStyle w:val="Testopreformattatouser"/>
+        <w:pStyle w:val="Testopreformattato"/>
         <w:rPr>
           <w:highlight w:val="none"/>
           <w:shd w:fill="FFFF00" w:val="clear"/>
@@ -3533,7 +3117,7 @@
     </w:p>
     <w:p>
       <w:pPr>
-        <w:pStyle w:val="Testopreformattatouser"/>
+        <w:pStyle w:val="Testopreformattato"/>
         <w:rPr>
           <w:highlight w:val="none"/>
           <w:shd w:fill="auto" w:val="clear"/>
@@ -3559,56 +3143,12 @@
           <w:shd w:fill="auto" w:val="clear"/>
           <w:lang w:val="it-IT"/>
         </w:rPr>
-        <w:t xml:space="preserve">PROCESSI COGNITIVI: pensiero critico, </w:t>
-      </w:r>
-      <w:r>
-        <w:rPr>
-          <w:rFonts w:cs="Liberation Mono"/>
-          <w:color w:val="000000"/>
-          <w:sz w:val="18"/>
-          <w:szCs w:val="18"/>
-          <w:shd w:fill="auto" w:val="clear"/>
-          <w:lang w:val="it-IT"/>
-        </w:rPr>
-        <w:t xml:space="preserve">3pensiero critico, </w:t>
-      </w:r>
-      <w:r>
-        <w:rPr>
-          <w:rFonts w:cs="Liberation Mono"/>
-          <w:color w:val="000000"/>
-          <w:sz w:val="18"/>
-          <w:szCs w:val="18"/>
-          <w:shd w:fill="auto" w:val="clear"/>
-          <w:lang w:val="it-IT"/>
-        </w:rPr>
-        <w:t xml:space="preserve">astrazione, analizzare processi, pensiero logico, riflettere sull’esperienza, comprensione di istruzioni, valutazione attendibilità di informazioni, capacità di previsione, osservazione/ memoria/ analisi, </w:t>
-      </w:r>
-      <w:r>
-        <w:rPr>
-          <w:rFonts w:cs="Liberation Mono"/>
-          <w:color w:val="000000"/>
-          <w:sz w:val="18"/>
-          <w:szCs w:val="18"/>
-          <w:shd w:fill="auto" w:val="clear"/>
-          <w:lang w:val="it-IT"/>
-        </w:rPr>
-        <w:t>3pianificazione</w:t>
-      </w:r>
-      <w:r>
-        <w:rPr>
-          <w:rFonts w:cs="Liberation Mono"/>
-          <w:color w:val="000000"/>
-          <w:sz w:val="18"/>
-          <w:szCs w:val="18"/>
-          <w:shd w:fill="auto" w:val="clear"/>
-          <w:lang w:val="it-IT"/>
-        </w:rPr>
-        <w:t>.</w:t>
+        <w:t>PROCESSI COGNITIVI: pensiero critico, 3pensiero critico, astrazione, analizzare processi, pensiero logico, riflettere sull’esperienza, comprensione di istruzioni, valutazione attendibilità di informazioni, capacità di previsione, osservazione/ memoria/ analisi, 3pianificazione.</w:t>
       </w:r>
     </w:p>
     <w:p>
       <w:pPr>
-        <w:pStyle w:val="Testopreformattatouser"/>
+        <w:pStyle w:val="Testopreformattato"/>
         <w:rPr>
           <w:highlight w:val="none"/>
           <w:shd w:fill="auto" w:val="clear"/>
@@ -3639,7 +3179,7 @@
     </w:p>
     <w:p>
       <w:pPr>
-        <w:pStyle w:val="Testopreformattatouser"/>
+        <w:pStyle w:val="Testopreformattato"/>
         <w:rPr>
           <w:highlight w:val="none"/>
           <w:shd w:fill="auto" w:val="clear"/>
@@ -3670,7 +3210,7 @@
     </w:p>
     <w:p>
       <w:pPr>
-        <w:pStyle w:val="Testopreformattatouser"/>
+        <w:pStyle w:val="Testopreformattato"/>
         <w:rPr>
           <w:highlight w:val="none"/>
           <w:shd w:fill="auto" w:val="clear"/>
@@ -3701,7 +3241,7 @@
     </w:p>
     <w:p>
       <w:pPr>
-        <w:pStyle w:val="Testopreformattatouser"/>
+        <w:pStyle w:val="Testopreformattato"/>
         <w:rPr>
           <w:highlight w:val="none"/>
           <w:shd w:fill="auto" w:val="clear"/>
@@ -3727,23 +3267,12 @@
           <w:shd w:fill="auto" w:val="clear"/>
           <w:lang w:val="it-IT"/>
         </w:rPr>
-        <w:t xml:space="preserve">RELAZIONALE-SOCIALE: capacità di ascolto, empatia, punto di vista dell’altro, capacità relazionali, </w:t>
-      </w:r>
-      <w:r>
-        <w:rPr>
-          <w:rFonts w:cs="Liberation Mono"/>
-          <w:color w:val="000000"/>
-          <w:sz w:val="18"/>
-          <w:szCs w:val="18"/>
-          <w:shd w:fill="auto" w:val="clear"/>
-          <w:lang w:val="it-IT"/>
-        </w:rPr>
-        <w:t>inclusione</w:t>
+        <w:t>RELAZIONALE-SOCIALE: capacità di ascolto, empatia, punto di vista dell’altro, capacità relazionali, inclusione</w:t>
       </w:r>
     </w:p>
     <w:p>
       <w:pPr>
-        <w:pStyle w:val="Testopreformattatouser"/>
+        <w:pStyle w:val="Testopreformattato"/>
         <w:rPr>
           <w:rFonts w:cs="Liberation Mono"/>
           <w:color w:val="000000"/>
@@ -3758,13 +3287,13 @@
           <w:color w:val="000000"/>
           <w:sz w:val="18"/>
           <w:szCs w:val="18"/>
-          <w:shd w:fill="auto" w:val="clear"/>
+          <w:lang w:val="it-IT"/>
         </w:rPr>
       </w:r>
     </w:p>
     <w:p>
       <w:pPr>
-        <w:pStyle w:val="Testopreformattatouser"/>
+        <w:pStyle w:val="Testopreformattato"/>
         <w:rPr>
           <w:rFonts w:ascii="Liberation Mono" w:hAnsi="Liberation Mono" w:cs="Liberation Mono"/>
           <w:color w:val="000000"/>
@@ -3785,7 +3314,7 @@
     </w:p>
     <w:p>
       <w:pPr>
-        <w:pStyle w:val="Testopreformattatouser"/>
+        <w:pStyle w:val="Testopreformattato"/>
         <w:rPr>
           <w:highlight w:val="none"/>
           <w:shd w:fill="FFFF00" w:val="clear"/>
@@ -3805,7 +3334,7 @@
     </w:p>
     <w:p>
       <w:pPr>
-        <w:pStyle w:val="Testopreformattatouser"/>
+        <w:pStyle w:val="Testopreformattato"/>
         <w:rPr>
           <w:highlight w:val="none"/>
           <w:shd w:fill="auto" w:val="clear"/>
@@ -3836,7 +3365,7 @@
     </w:p>
     <w:p>
       <w:pPr>
-        <w:pStyle w:val="Testopreformattatouser"/>
+        <w:pStyle w:val="Testopreformattato"/>
         <w:rPr>
           <w:highlight w:val="none"/>
           <w:shd w:fill="auto" w:val="clear"/>
@@ -3862,56 +3391,12 @@
           <w:shd w:fill="auto" w:val="clear"/>
           <w:lang w:val="it-IT"/>
         </w:rPr>
-        <w:t xml:space="preserve">COMUNICAZIONE: comunicare con tecnologia, competenze narrative, </w:t>
-      </w:r>
-      <w:r>
-        <w:rPr>
-          <w:rFonts w:cs="Liberation Mono"/>
-          <w:color w:val="000000"/>
-          <w:sz w:val="18"/>
-          <w:szCs w:val="18"/>
-          <w:shd w:fill="auto" w:val="clear"/>
-          <w:lang w:val="it-IT"/>
-        </w:rPr>
-        <w:t xml:space="preserve">3capacità di narrazione, </w:t>
-      </w:r>
-      <w:r>
-        <w:rPr>
-          <w:rFonts w:cs="Liberation Mono"/>
-          <w:color w:val="000000"/>
-          <w:sz w:val="18"/>
-          <w:szCs w:val="18"/>
-          <w:shd w:fill="auto" w:val="clear"/>
-          <w:lang w:val="it-IT"/>
-        </w:rPr>
-        <w:t>comunicazione con linguaggio specifico, descrizione di strategie,</w:t>
-      </w:r>
-      <w:r>
-        <w:rPr>
-          <w:rFonts w:cs="Liberation Mono"/>
-          <w:color w:val="000000"/>
-          <w:sz w:val="18"/>
-          <w:szCs w:val="18"/>
-          <w:shd w:fill="auto" w:val="clear"/>
-          <w:lang w:val="it-IT"/>
-        </w:rPr>
-        <w:t xml:space="preserve"> utilizzare codici e linguaggi diversi, </w:t>
-      </w:r>
-      <w:r>
-        <w:rPr>
-          <w:rFonts w:cs="Liberation Mono"/>
-          <w:color w:val="000000"/>
-          <w:sz w:val="18"/>
-          <w:szCs w:val="18"/>
-          <w:shd w:fill="auto" w:val="clear"/>
-          <w:lang w:val="it-IT"/>
-        </w:rPr>
-        <w:t>3presentazione.</w:t>
+        <w:t>COMUNICAZIONE: comunicare con tecnologia, competenze narrative, 3capacità di narrazione, comunicazione con linguaggio specifico, descrizione di strategie, utilizzare codici e linguaggi diversi, 3presentazione.</w:t>
       </w:r>
     </w:p>
     <w:p>
       <w:pPr>
-        <w:pStyle w:val="Testopreformattatouser"/>
+        <w:pStyle w:val="Testopreformattato"/>
         <w:rPr>
           <w:highlight w:val="none"/>
           <w:shd w:fill="auto" w:val="clear"/>
@@ -3937,34 +3422,12 @@
           <w:shd w:fill="auto" w:val="clear"/>
           <w:lang w:val="it-IT"/>
         </w:rPr>
-        <w:t xml:space="preserve">COLLABORAZIONE: peer-to-peer, cooperative learning, collaborazione/ lavoro squadra, </w:t>
-      </w:r>
-      <w:r>
-        <w:rPr>
-          <w:rFonts w:cs="Liberation Mono"/>
-          <w:color w:val="000000"/>
-          <w:sz w:val="18"/>
-          <w:szCs w:val="18"/>
-          <w:shd w:fill="auto" w:val="clear"/>
-          <w:lang w:val="it-IT"/>
-        </w:rPr>
-        <w:t>3conversazione collaborativa / collaborazione, 3lavoro in coppia</w:t>
-      </w:r>
-      <w:r>
-        <w:rPr>
-          <w:rFonts w:cs="Liberation Mono"/>
-          <w:color w:val="000000"/>
-          <w:sz w:val="18"/>
-          <w:szCs w:val="18"/>
-          <w:shd w:fill="auto" w:val="clear"/>
-          <w:lang w:val="it-IT"/>
-        </w:rPr>
-        <w:t>.</w:t>
+        <w:t>COLLABORAZIONE: peer-to-peer, cooperative learning, collaborazione/ lavoro squadra, 3conversazione collaborativa / collaborazione, 3lavoro in coppia.</w:t>
       </w:r>
     </w:p>
     <w:p>
       <w:pPr>
-        <w:pStyle w:val="Testopreformattatouser"/>
+        <w:pStyle w:val="Testopreformattato"/>
         <w:rPr>
           <w:highlight w:val="none"/>
           <w:shd w:fill="auto" w:val="clear"/>
@@ -3995,7 +3458,7 @@
     </w:p>
     <w:p>
       <w:pPr>
-        <w:pStyle w:val="Testopreformattatouser"/>
+        <w:pStyle w:val="Testopreformattato"/>
         <w:rPr>
           <w:highlight w:val="none"/>
           <w:shd w:fill="auto" w:val="clear"/>
@@ -4026,7 +3489,7 @@
     </w:p>
     <w:p>
       <w:pPr>
-        <w:pStyle w:val="Testopreformattatouser"/>
+        <w:pStyle w:val="Testopreformattato"/>
         <w:rPr>
           <w:highlight w:val="none"/>
           <w:shd w:fill="auto" w:val="clear"/>
@@ -4057,7 +3520,7 @@
     </w:p>
     <w:p>
       <w:pPr>
-        <w:pStyle w:val="Testopreformattatouser"/>
+        <w:pStyle w:val="Testopreformattato"/>
         <w:ind w:hanging="0"/>
         <w:rPr>
           <w:highlight w:val="none"/>
@@ -4084,29 +3547,7 @@
           <w:shd w:fill="auto" w:val="clear"/>
           <w:lang w:val="it-IT"/>
         </w:rPr>
-        <w:t xml:space="preserve">CREATIVITÀ: </w:t>
-      </w:r>
-      <w:r>
-        <w:rPr>
-          <w:rFonts w:cs="Liberation Mono"/>
-          <w:color w:val="000000"/>
-          <w:sz w:val="18"/>
-          <w:szCs w:val="18"/>
-          <w:shd w:fill="auto" w:val="clear"/>
-          <w:lang w:val="it-IT"/>
-        </w:rPr>
-        <w:t xml:space="preserve">3pensiero creativo, </w:t>
-      </w:r>
-      <w:r>
-        <w:rPr>
-          <w:rFonts w:cs="Liberation Mono"/>
-          <w:color w:val="000000"/>
-          <w:sz w:val="18"/>
-          <w:szCs w:val="18"/>
-          <w:shd w:fill="auto" w:val="clear"/>
-          <w:lang w:val="it-IT"/>
-        </w:rPr>
-        <w:t xml:space="preserve">creatività, gioco (giocare in modo creativo), </w:t>
+        <w:t xml:space="preserve">CREATIVITÀ: 3pensiero creativo, creatività, gioco (giocare in modo creativo), </w:t>
       </w:r>
       <w:r>
         <w:rPr>
@@ -4133,7 +3574,7 @@
     </w:p>
     <w:p>
       <w:pPr>
-        <w:pStyle w:val="Testopreformattatouser"/>
+        <w:pStyle w:val="Testopreformattato"/>
         <w:ind w:hanging="0"/>
         <w:rPr>
           <w:highlight w:val="none"/>
@@ -4186,7 +3627,7 @@
     </w:p>
     <w:p>
       <w:pPr>
-        <w:pStyle w:val="Testopreformattatouser"/>
+        <w:pStyle w:val="Testopreformattato"/>
         <w:rPr>
           <w:rFonts w:ascii="Liberation Mono" w:hAnsi="Liberation Mono" w:cs="Liberation Mono"/>
           <w:color w:val="000000"/>
@@ -4206,7 +3647,7 @@
     </w:p>
     <w:p>
       <w:pPr>
-        <w:pStyle w:val="Testopreformattatouser"/>
+        <w:pStyle w:val="Testopreformattato"/>
         <w:rPr>
           <w:rFonts w:ascii="Liberation Mono" w:hAnsi="Liberation Mono" w:cs="Liberation Mono"/>
           <w:color w:val="000000"/>
@@ -4227,7 +3668,7 @@
     </w:p>
     <w:p>
       <w:pPr>
-        <w:pStyle w:val="Testopreformattatouser"/>
+        <w:pStyle w:val="Testopreformattato"/>
         <w:rPr>
           <w:highlight w:val="none"/>
           <w:shd w:fill="FFFF00" w:val="clear"/>
@@ -4247,7 +3688,7 @@
     </w:p>
     <w:p>
       <w:pPr>
-        <w:pStyle w:val="Testopreformattatouser"/>
+        <w:pStyle w:val="Testopreformattato"/>
         <w:rPr>
           <w:highlight w:val="none"/>
           <w:shd w:fill="auto" w:val="clear"/>
@@ -4273,23 +3714,12 @@
           <w:shd w:fill="auto" w:val="clear"/>
           <w:lang w:val="it-IT"/>
         </w:rPr>
-        <w:t xml:space="preserve">ITALIANO: italiano, comprensione del testo, costruzione di un testo, alfabetico-funzionale, scrittura, ascolto e parlato, </w:t>
-      </w:r>
-      <w:r>
-        <w:rPr>
-          <w:rFonts w:cs="Liberation Mono"/>
-          <w:color w:val="000000"/>
-          <w:sz w:val="18"/>
-          <w:szCs w:val="18"/>
-          <w:shd w:fill="auto" w:val="clear"/>
-          <w:lang w:val="it-IT"/>
-        </w:rPr>
-        <w:t>competenze linguistiche.</w:t>
+        <w:t>ITALIANO: italiano, comprensione del testo, costruzione di un testo, alfabetico-funzionale, scrittura, ascolto e parlato, competenze linguistiche.</w:t>
       </w:r>
     </w:p>
     <w:p>
       <w:pPr>
-        <w:pStyle w:val="Testopreformattatouser"/>
+        <w:pStyle w:val="Testopreformattato"/>
         <w:rPr>
           <w:highlight w:val="none"/>
           <w:shd w:fill="auto" w:val="clear"/>
@@ -4320,7 +3750,7 @@
     </w:p>
     <w:p>
       <w:pPr>
-        <w:pStyle w:val="Testopreformattatouser"/>
+        <w:pStyle w:val="Testopreformattato"/>
         <w:rPr>
           <w:highlight w:val="none"/>
           <w:shd w:fill="auto" w:val="clear"/>
@@ -4346,34 +3776,12 @@
           <w:shd w:fill="auto" w:val="clear"/>
           <w:lang w:val="it-IT"/>
         </w:rPr>
-        <w:t xml:space="preserve">GEOGRAFIA: geografia, </w:t>
-      </w:r>
-      <w:r>
-        <w:rPr>
-          <w:rFonts w:cs="Liberation Mono"/>
-          <w:color w:val="000000"/>
-          <w:sz w:val="18"/>
-          <w:szCs w:val="18"/>
-          <w:shd w:fill="auto" w:val="clear"/>
-          <w:lang w:val="it-IT"/>
-        </w:rPr>
-        <w:t>3costruzione di mappe, 3mappe</w:t>
-      </w:r>
-      <w:r>
-        <w:rPr>
-          <w:rFonts w:cs="Liberation Mono"/>
-          <w:color w:val="000000"/>
-          <w:sz w:val="18"/>
-          <w:szCs w:val="18"/>
-          <w:shd w:fill="auto" w:val="clear"/>
-          <w:lang w:val="it-IT"/>
-        </w:rPr>
-        <w:t>.</w:t>
+        <w:t>GEOGRAFIA: geografia, 3costruzione di mappe, 3mappe.</w:t>
       </w:r>
     </w:p>
     <w:p>
       <w:pPr>
-        <w:pStyle w:val="Testopreformattatouser"/>
+        <w:pStyle w:val="Testopreformattato"/>
         <w:rPr>
           <w:highlight w:val="none"/>
           <w:shd w:fill="auto" w:val="clear"/>
@@ -4398,7 +3806,7 @@
     </w:p>
     <w:p>
       <w:pPr>
-        <w:pStyle w:val="Testopreformattatouser"/>
+        <w:pStyle w:val="Testopreformattato"/>
         <w:rPr>
           <w:highlight w:val="none"/>
           <w:shd w:fill="auto" w:val="clear"/>
@@ -4429,7 +3837,7 @@
     </w:p>
     <w:p>
       <w:pPr>
-        <w:pStyle w:val="Testopreformattatouser"/>
+        <w:pStyle w:val="Testopreformattato"/>
         <w:rPr>
           <w:rFonts w:cs="Liberation Mono"/>
           <w:color w:val="000000"/>
@@ -4460,34 +3868,12 @@
           <w:shd w:fill="auto" w:val="clear"/>
           <w:lang w:val="it-IT"/>
         </w:rPr>
-        <w:t xml:space="preserve">MATEMATICA: spazio e figure, geometria, matematica, operazioni retta dei numeri, rappresentazione dei dati, contorno di figura piana, sequenzialità, lato, modelli geometrici, </w:t>
-      </w:r>
-      <w:r>
-        <w:rPr>
-          <w:rFonts w:cs="Liberation Mono"/>
-          <w:color w:val="000000"/>
-          <w:sz w:val="18"/>
-          <w:szCs w:val="18"/>
-          <w:shd w:fill="auto" w:val="clear"/>
-          <w:lang w:val="it-IT"/>
-        </w:rPr>
-        <w:t>3conteggio</w:t>
-      </w:r>
-      <w:r>
-        <w:rPr>
-          <w:rFonts w:cs="Liberation Mono"/>
-          <w:color w:val="000000"/>
-          <w:sz w:val="18"/>
-          <w:szCs w:val="18"/>
-          <w:shd w:fill="auto" w:val="clear"/>
-          <w:lang w:val="it-IT"/>
-        </w:rPr>
-        <w:t>.</w:t>
+        <w:t>MATEMATICA: spazio e figure, geometria, matematica, operazioni retta dei numeri, rappresentazione dei dati, contorno di figura piana, sequenzialità, lato, modelli geometrici, 3conteggio.</w:t>
       </w:r>
     </w:p>
     <w:p>
       <w:pPr>
-        <w:pStyle w:val="Testopreformattatouser"/>
+        <w:pStyle w:val="Testopreformattato"/>
         <w:rPr>
           <w:rFonts w:cs="Liberation Mono"/>
           <w:color w:val="000000"/>
@@ -4518,34 +3904,12 @@
           <w:shd w:fill="auto" w:val="clear"/>
           <w:lang w:val="it-IT"/>
         </w:rPr>
-        <w:t>SPAZIALITÀ: riferimenti spaziali/ indicatori topologici, orientamento spaziale</w:t>
-      </w:r>
-      <w:r>
-        <w:rPr>
-          <w:rFonts w:cs="Liberation Mono"/>
-          <w:color w:val="000000"/>
-          <w:sz w:val="18"/>
-          <w:szCs w:val="18"/>
-          <w:shd w:fill="auto" w:val="clear"/>
-          <w:lang w:val="it-IT"/>
-        </w:rPr>
-        <w:t>, 3orientamento spaziale, 3indicazioni topologiche</w:t>
-      </w:r>
-      <w:r>
-        <w:rPr>
-          <w:rFonts w:cs="Liberation Mono"/>
-          <w:color w:val="000000"/>
-          <w:sz w:val="18"/>
-          <w:szCs w:val="18"/>
-          <w:shd w:fill="auto" w:val="clear"/>
-          <w:lang w:val="it-IT"/>
-        </w:rPr>
-        <w:t>.</w:t>
+        <w:t>SPAZIALITÀ: riferimenti spaziali/ indicatori topologici, orientamento spaziale, 3orientamento spaziale, 3indicazioni topologiche.</w:t>
       </w:r>
     </w:p>
     <w:p>
       <w:pPr>
-        <w:pStyle w:val="Testopreformattatouser"/>
+        <w:pStyle w:val="Testopreformattato"/>
         <w:rPr>
           <w:highlight w:val="none"/>
           <w:shd w:fill="auto" w:val="clear"/>
@@ -4576,7 +3940,7 @@
     </w:p>
     <w:p>
       <w:pPr>
-        <w:pStyle w:val="Testopreformattatouser"/>
+        <w:pStyle w:val="Testopreformattato"/>
         <w:rPr>
           <w:rFonts w:cs="Liberation Mono"/>
           <w:color w:val="000000"/>
@@ -4612,7 +3976,7 @@
     </w:p>
     <w:p>
       <w:pPr>
-        <w:pStyle w:val="Testopreformattatouser"/>
+        <w:pStyle w:val="Testopreformattato"/>
         <w:rPr>
           <w:highlight w:val="none"/>
           <w:shd w:fill="auto" w:val="clear"/>
@@ -4643,7 +4007,7 @@
     </w:p>
     <w:p>
       <w:pPr>
-        <w:pStyle w:val="Testopreformattatouser"/>
+        <w:pStyle w:val="Testopreformattato"/>
         <w:spacing w:before="0" w:after="0"/>
         <w:rPr>
           <w:rFonts w:ascii="Liberation Mono" w:hAnsi="Liberation Mono" w:cs="Liberation Mono"/>
@@ -4670,7 +4034,7 @@
     </w:p>
     <w:p>
       <w:pPr>
-        <w:pStyle w:val="Testopreformattatouser"/>
+        <w:pStyle w:val="Testopreformattato"/>
         <w:rPr>
           <w:rFonts w:ascii="Liberation Mono" w:hAnsi="Liberation Mono" w:cs="Liberation Mono"/>
           <w:color w:val="000000"/>
@@ -4691,7 +4055,7 @@
     </w:p>
     <w:p>
       <w:pPr>
-        <w:pStyle w:val="Testopreformattatouser"/>
+        <w:pStyle w:val="Testopreformattato"/>
         <w:rPr>
           <w:highlight w:val="none"/>
           <w:shd w:fill="FFFF00" w:val="clear"/>
@@ -4711,7 +4075,7 @@
     </w:p>
     <w:p>
       <w:pPr>
-        <w:pStyle w:val="Testopreformattatouser"/>
+        <w:pStyle w:val="Testopreformattato"/>
         <w:rPr>
           <w:rFonts w:ascii="Liberation Mono" w:hAnsi="Liberation Mono" w:cs="Liberation Mono"/>
           <w:color w:val="000000"/>
@@ -4737,22 +4101,12 @@
           <w:szCs w:val="18"/>
           <w:lang w:val="it-IT"/>
         </w:rPr>
-        <w:t xml:space="preserve">COPIA RISPOSTA 2: </w:t>
-      </w:r>
-      <w:r>
-        <w:rPr>
-          <w:rFonts w:cs="Liberation Mono"/>
-          <w:color w:val="000000"/>
-          <w:sz w:val="18"/>
-          <w:szCs w:val="18"/>
-          <w:lang w:val="it-IT"/>
-        </w:rPr>
-        <w:t>copia-incolla risposta 2.</w:t>
+        <w:t>COPIA RISPOSTA 2: copia-incolla risposta 2.</w:t>
       </w:r>
     </w:p>
     <w:p>
       <w:pPr>
-        <w:pStyle w:val="Testopreformattatouser"/>
+        <w:pStyle w:val="Testopreformattato"/>
         <w:rPr>
           <w:rFonts w:ascii="Liberation Mono" w:hAnsi="Liberation Mono" w:cs="Liberation Mono"/>
           <w:color w:val="000000"/>
@@ -4783,7 +4137,7 @@
     </w:p>
     <w:p>
       <w:pPr>
-        <w:pStyle w:val="Testopreformattatouser"/>
+        <w:pStyle w:val="Testopreformattato"/>
         <w:rPr>
           <w:rFonts w:ascii="Liberation Mono" w:hAnsi="Liberation Mono" w:cs="Liberation Mono"/>
           <w:color w:val="000000"/>
@@ -4809,17 +4163,7 @@
           <w:szCs w:val="18"/>
           <w:lang w:val="it-IT"/>
         </w:rPr>
-        <w:t xml:space="preserve">VUOTO-D3: </w:t>
-      </w:r>
-      <w:r>
-        <w:rPr>
-          <w:rFonts w:cs="Liberation Mono"/>
-          <w:color w:val="000000"/>
-          <w:sz w:val="18"/>
-          <w:szCs w:val="18"/>
-          <w:lang w:val="it-IT"/>
-        </w:rPr>
-        <w:t>vuoto.</w:t>
+        <w:t>VUOTO-D3: vuoto.</w:t>
       </w:r>
     </w:p>
     <w:sectPr>
@@ -5388,16 +4732,15 @@
       <w:sz w:val="20"/>
     </w:rPr>
   </w:style>
-  <w:style w:type="character" w:styleId="Caratterinotaapidipaginauser" w:customStyle="1">
-    <w:name w:val="Caratteri nota a piè di pagina (user)"/>
-    <w:basedOn w:val="DefaultParagraphFont"/>
+  <w:style w:type="character" w:styleId="Caratterinotaapidipagina" w:customStyle="1">
+    <w:name w:val="Caratteri nota a piè di pagina"/>
     <w:qFormat/>
     <w:rPr>
       <w:vertAlign w:val="superscript"/>
     </w:rPr>
   </w:style>
-  <w:style w:type="character" w:styleId="Caratterinotaapidipagina">
-    <w:name w:val="Caratteri nota a piè di pagina"/>
+  <w:style w:type="character" w:styleId="Caratterinotaapidipaginauser">
+    <w:name w:val="Caratteri nota a piè di pagina (user)"/>
     <w:qFormat/>
     <w:rPr>
       <w:vertAlign w:val="superscript"/>
@@ -5417,16 +4760,15 @@
       <w:sz w:val="20"/>
     </w:rPr>
   </w:style>
-  <w:style w:type="character" w:styleId="Caratterinotadichiusurauser" w:customStyle="1">
-    <w:name w:val="Caratteri nota di chiusura (user)"/>
-    <w:basedOn w:val="DefaultParagraphFont"/>
+  <w:style w:type="character" w:styleId="Caratterinotadichiusura" w:customStyle="1">
+    <w:name w:val="Caratteri nota di chiusura"/>
     <w:qFormat/>
     <w:rPr>
       <w:vertAlign w:val="superscript"/>
     </w:rPr>
   </w:style>
-  <w:style w:type="character" w:styleId="Caratterinotadichiusura">
-    <w:name w:val="Caratteri nota di chiusura"/>
+  <w:style w:type="character" w:styleId="Caratterinotadichiusurauser">
+    <w:name w:val="Caratteri nota di chiusura (user)"/>
     <w:qFormat/>
     <w:rPr>
       <w:vertAlign w:val="superscript"/>
@@ -5509,8 +4851,55 @@
     <w:qFormat/>
     <w:rPr/>
   </w:style>
-  <w:style w:type="paragraph" w:styleId="Titolo">
+  <w:style w:type="paragraph" w:styleId="Titolo" w:customStyle="1">
     <w:name w:val="Titolo"/>
+    <w:basedOn w:val="Standard"/>
+    <w:next w:val="BodyText"/>
+    <w:qFormat/>
+    <w:pPr>
+      <w:spacing w:before="240" w:after="120"/>
+    </w:pPr>
+    <w:rPr>
+      <w:rFonts w:ascii="Liberation Sans" w:hAnsi="Liberation Sans" w:cs="Liberation Sans"/>
+      <w:sz w:val="28"/>
+    </w:rPr>
+  </w:style>
+  <w:style w:type="paragraph" w:styleId="BodyText">
+    <w:name w:val="Body Text"/>
+    <w:basedOn w:val="Normal"/>
+    <w:pPr>
+      <w:spacing w:lineRule="auto" w:line="276" w:before="0" w:after="140"/>
+    </w:pPr>
+    <w:rPr/>
+  </w:style>
+  <w:style w:type="paragraph" w:styleId="List" w:customStyle="1">
+    <w:name w:val="List"/>
+    <w:basedOn w:val="Textbody"/>
+    <w:qFormat/>
+    <w:pPr/>
+    <w:rPr/>
+  </w:style>
+  <w:style w:type="paragraph" w:styleId="Caption" w:customStyle="1">
+    <w:name w:val="caption"/>
+    <w:basedOn w:val="Standard"/>
+    <w:qFormat/>
+    <w:pPr>
+      <w:spacing w:before="120" w:after="120"/>
+    </w:pPr>
+    <w:rPr>
+      <w:i/>
+      <w:sz w:val="24"/>
+    </w:rPr>
+  </w:style>
+  <w:style w:type="paragraph" w:styleId="Indice" w:customStyle="1">
+    <w:name w:val="Indice"/>
+    <w:basedOn w:val="Standard"/>
+    <w:qFormat/>
+    <w:pPr/>
+    <w:rPr/>
+  </w:style>
+  <w:style w:type="paragraph" w:styleId="Titolouser">
+    <w:name w:val="Titolo (user)"/>
     <w:basedOn w:val="Normal"/>
     <w:next w:val="BodyText"/>
     <w:qFormat/>
@@ -5524,35 +4913,8 @@
       <w:szCs w:val="28"/>
     </w:rPr>
   </w:style>
-  <w:style w:type="paragraph" w:styleId="BodyText">
-    <w:name w:val="Body Text"/>
-    <w:basedOn w:val="Normal"/>
-    <w:pPr>
-      <w:spacing w:lineRule="auto" w:line="276" w:before="0" w:after="140"/>
-    </w:pPr>
-    <w:rPr/>
-  </w:style>
-  <w:style w:type="paragraph" w:styleId="List" w:customStyle="1">
-    <w:name w:val="List"/>
-    <w:basedOn w:val="Textbody"/>
-    <w:qFormat/>
-    <w:pPr/>
-    <w:rPr/>
-  </w:style>
-  <w:style w:type="paragraph" w:styleId="Caption" w:customStyle="1">
-    <w:name w:val="caption"/>
-    <w:basedOn w:val="Standard"/>
-    <w:qFormat/>
-    <w:pPr>
-      <w:spacing w:before="120" w:after="120"/>
-    </w:pPr>
-    <w:rPr>
-      <w:i/>
-      <w:sz w:val="24"/>
-    </w:rPr>
-  </w:style>
-  <w:style w:type="paragraph" w:styleId="Indice">
-    <w:name w:val="Indice"/>
+  <w:style w:type="paragraph" w:styleId="Indiceuser">
+    <w:name w:val="Indice (user)"/>
     <w:basedOn w:val="Normal"/>
     <w:qFormat/>
     <w:pPr>
@@ -5561,26 +4923,6 @@
     <w:rPr>
       <w:rFonts w:ascii="Calibri" w:hAnsi="Calibri" w:cs="Lucida Sans"/>
     </w:rPr>
-  </w:style>
-  <w:style w:type="paragraph" w:styleId="Titolouser" w:customStyle="1">
-    <w:name w:val="Titolo (user)"/>
-    <w:basedOn w:val="Standard"/>
-    <w:next w:val="BodyText"/>
-    <w:qFormat/>
-    <w:pPr>
-      <w:spacing w:before="240" w:after="120"/>
-    </w:pPr>
-    <w:rPr>
-      <w:rFonts w:ascii="Liberation Sans" w:hAnsi="Liberation Sans" w:cs="Liberation Sans"/>
-      <w:sz w:val="28"/>
-    </w:rPr>
-  </w:style>
-  <w:style w:type="paragraph" w:styleId="Indiceuser" w:customStyle="1">
-    <w:name w:val="Indice (user)"/>
-    <w:basedOn w:val="Standard"/>
-    <w:qFormat/>
-    <w:pPr/>
-    <w:rPr/>
   </w:style>
   <w:style w:type="paragraph" w:styleId="DStyleparagraph" w:customStyle="1">
     <w:name w:val="DStyle_paragraph"/>
@@ -5667,15 +5009,15 @@
     </w:pPr>
     <w:rPr/>
   </w:style>
-  <w:style w:type="paragraph" w:styleId="Intestazioneepidipaginauser">
-    <w:name w:val="Intestazione e piè di pagina (user)"/>
+  <w:style w:type="paragraph" w:styleId="Intestazioneepidipagina">
+    <w:name w:val="Intestazione e piè di pagina"/>
     <w:basedOn w:val="Normal"/>
     <w:qFormat/>
     <w:pPr/>
     <w:rPr/>
   </w:style>
-  <w:style w:type="paragraph" w:styleId="Intestazioneepidipagina">
-    <w:name w:val="Intestazione e piè di pagina"/>
+  <w:style w:type="paragraph" w:styleId="Intestazioneepidipaginauser">
+    <w:name w:val="Intestazione e piè di pagina (user)"/>
     <w:basedOn w:val="Normal"/>
     <w:qFormat/>
     <w:pPr/>
@@ -5822,7 +5164,7 @@
   </w:style>
   <w:style w:type="paragraph" w:styleId="IndexHeading">
     <w:name w:val="index heading"/>
-    <w:basedOn w:val="Titolouser"/>
+    <w:basedOn w:val="Titolo"/>
     <w:pPr/>
     <w:rPr/>
   </w:style>
@@ -5858,8 +5200,8 @@
     </w:pPr>
     <w:rPr/>
   </w:style>
-  <w:style w:type="paragraph" w:styleId="Testopreformattatouser" w:customStyle="1">
-    <w:name w:val="Testo preformattato (user)"/>
+  <w:style w:type="paragraph" w:styleId="Testopreformattato" w:customStyle="1">
+    <w:name w:val="Testo preformattato"/>
     <w:basedOn w:val="Standard"/>
     <w:qFormat/>
     <w:pPr>
@@ -5870,8 +5212,8 @@
       <w:sz w:val="20"/>
     </w:rPr>
   </w:style>
-  <w:style w:type="numbering" w:styleId="Nessunelencouser" w:default="1">
-    <w:name w:val="Nessun elenco (user)"/>
+  <w:style w:type="numbering" w:styleId="Nessunelenco" w:default="1">
+    <w:name w:val="Nessun elenco"/>
     <w:uiPriority w:val="99"/>
     <w:semiHidden/>
     <w:unhideWhenUsed/>

</xml_diff>